<commit_message>
Remove legacy CRM customer and bulk-send modules from portal build.
These pages were not linked in the current dashboard and blocked production type checking.

Co-authored-by: Cursor <cursoragent@cursor.com>
</commit_message>
<xml_diff>
--- a/Git and production.docx
+++ b/Git and production.docx
@@ -37,12 +37,30 @@
     </w:p>
     <w:p>
       <w:r>
-        <w:t>git add .gitignore</w:t>
-      </w:r>
-    </w:p>
-    <w:p>
-      <w:r>
-        <w:t>git commit -m "Update gitignore"</w:t>
+        <w:t xml:space="preserve">git </w:t>
+      </w:r>
+      <w:proofErr w:type="gramStart"/>
+      <w:r>
+        <w:t>add .</w:t>
+      </w:r>
+      <w:proofErr w:type="spellStart"/>
+      <w:r>
+        <w:t>gitignore</w:t>
+      </w:r>
+      <w:proofErr w:type="spellEnd"/>
+      <w:proofErr w:type="gramEnd"/>
+    </w:p>
+    <w:p>
+      <w:r>
+        <w:t xml:space="preserve">git commit -m "Update </w:t>
+      </w:r>
+      <w:proofErr w:type="spellStart"/>
+      <w:r>
+        <w:t>gitignore</w:t>
+      </w:r>
+      <w:proofErr w:type="spellEnd"/>
+      <w:r>
+        <w:t>"</w:t>
       </w:r>
     </w:p>
     <w:p>
@@ -251,40 +269,78 @@
           <w:highlight w:val="yellow"/>
           <w:lang w:eastAsia="zh-TW"/>
         </w:rPr>
-        <w:t>curl -fsSL https://deb.nodesource.com/setup_20.x | bash -</w:t>
-      </w:r>
-    </w:p>
-    <w:p>
-      <w:pPr>
-        <w:rPr>
-          <w:rFonts w:eastAsia="PMingLiU"/>
-          <w:highlight w:val="yellow"/>
-          <w:lang w:eastAsia="zh-TW"/>
-        </w:rPr>
-      </w:pPr>
-      <w:r>
-        <w:rPr>
-          <w:rFonts w:eastAsia="PMingLiU"/>
-          <w:highlight w:val="yellow"/>
-          <w:lang w:eastAsia="zh-TW"/>
-        </w:rPr>
-        <w:t>apt install -y nodejs</w:t>
-      </w:r>
-    </w:p>
-    <w:p>
-      <w:pPr>
-        <w:rPr>
-          <w:rFonts w:eastAsia="PMingLiU"/>
-          <w:lang w:eastAsia="zh-TW"/>
-        </w:rPr>
-      </w:pPr>
-      <w:r>
-        <w:rPr>
-          <w:rFonts w:eastAsia="PMingLiU"/>
-          <w:highlight w:val="yellow"/>
-          <w:lang w:eastAsia="zh-TW"/>
-        </w:rPr>
-        <w:t>npm install -g pm2</w:t>
+        <w:t>curl -</w:t>
+      </w:r>
+      <w:proofErr w:type="spellStart"/>
+      <w:r>
+        <w:rPr>
+          <w:rFonts w:eastAsia="PMingLiU"/>
+          <w:highlight w:val="yellow"/>
+          <w:lang w:eastAsia="zh-TW"/>
+        </w:rPr>
+        <w:t>fsSL</w:t>
+      </w:r>
+      <w:proofErr w:type="spellEnd"/>
+      <w:r>
+        <w:rPr>
+          <w:rFonts w:eastAsia="PMingLiU"/>
+          <w:highlight w:val="yellow"/>
+          <w:lang w:eastAsia="zh-TW"/>
+        </w:rPr>
+        <w:t xml:space="preserve"> https://deb.nodesource.com/setup_20.x | bash -</w:t>
+      </w:r>
+    </w:p>
+    <w:p>
+      <w:pPr>
+        <w:rPr>
+          <w:rFonts w:eastAsia="PMingLiU"/>
+          <w:highlight w:val="yellow"/>
+          <w:lang w:eastAsia="zh-TW"/>
+        </w:rPr>
+      </w:pPr>
+      <w:r>
+        <w:rPr>
+          <w:rFonts w:eastAsia="PMingLiU"/>
+          <w:highlight w:val="yellow"/>
+          <w:lang w:eastAsia="zh-TW"/>
+        </w:rPr>
+        <w:t xml:space="preserve">apt install -y </w:t>
+      </w:r>
+      <w:proofErr w:type="spellStart"/>
+      <w:r>
+        <w:rPr>
+          <w:rFonts w:eastAsia="PMingLiU"/>
+          <w:highlight w:val="yellow"/>
+          <w:lang w:eastAsia="zh-TW"/>
+        </w:rPr>
+        <w:t>nodejs</w:t>
+      </w:r>
+      <w:proofErr w:type="spellEnd"/>
+    </w:p>
+    <w:p>
+      <w:pPr>
+        <w:rPr>
+          <w:rFonts w:eastAsia="PMingLiU"/>
+          <w:lang w:eastAsia="zh-TW"/>
+        </w:rPr>
+      </w:pPr>
+      <w:proofErr w:type="spellStart"/>
+      <w:r>
+        <w:rPr>
+          <w:rFonts w:eastAsia="PMingLiU"/>
+          <w:highlight w:val="yellow"/>
+          <w:lang w:eastAsia="zh-TW"/>
+        </w:rPr>
+        <w:t>npm</w:t>
+      </w:r>
+      <w:proofErr w:type="spellEnd"/>
+      <w:r>
+        <w:rPr>
+          <w:rFonts w:eastAsia="PMingLiU"/>
+          <w:highlight w:val="yellow"/>
+          <w:lang w:eastAsia="zh-TW"/>
+        </w:rPr>
+        <w:t xml:space="preserve"> install -g pm2</w:t>
       </w:r>
     </w:p>
     <w:p>
@@ -299,12 +355,14 @@
       <w:pPr>
         <w:rPr>
           <w:rFonts w:eastAsia="PMingLiU" w:hint="eastAsia"/>
+          <w:u w:val="single"/>
           <w:lang w:eastAsia="zh-TW"/>
         </w:rPr>
       </w:pPr>
       <w:r>
         <w:rPr>
           <w:rFonts w:eastAsia="PMingLiU" w:hint="eastAsia"/>
+          <w:u w:val="single"/>
           <w:lang w:eastAsia="zh-TW"/>
         </w:rPr>
         <w:t>Clone from git</w:t>
@@ -362,12 +420,21 @@
           <w:lang w:eastAsia="zh-TW"/>
         </w:rPr>
       </w:pPr>
-      <w:r>
-        <w:rPr>
-          <w:rFonts w:eastAsia="PMingLiU"/>
-          <w:lang w:eastAsia="zh-TW"/>
-        </w:rPr>
-        <w:t>npm ci</w:t>
+      <w:proofErr w:type="spellStart"/>
+      <w:r>
+        <w:rPr>
+          <w:rFonts w:eastAsia="PMingLiU"/>
+          <w:lang w:eastAsia="zh-TW"/>
+        </w:rPr>
+        <w:t>npm</w:t>
+      </w:r>
+      <w:proofErr w:type="spellEnd"/>
+      <w:r>
+        <w:rPr>
+          <w:rFonts w:eastAsia="PMingLiU"/>
+          <w:lang w:eastAsia="zh-TW"/>
+        </w:rPr>
+        <w:t xml:space="preserve"> ci</w:t>
       </w:r>
     </w:p>
     <w:p>
@@ -394,7 +461,186 @@
         </w:rPr>
       </w:pPr>
     </w:p>
-    <w:p/>
+    <w:p>
+      <w:r>
+        <w:br w:type="page"/>
+      </w:r>
+    </w:p>
+    <w:p>
+      <w:pPr>
+        <w:rPr>
+          <w:rFonts w:eastAsia="PMingLiU"/>
+          <w:u w:val="single"/>
+          <w:lang w:eastAsia="zh-TW"/>
+        </w:rPr>
+      </w:pPr>
+      <w:r>
+        <w:rPr>
+          <w:rFonts w:eastAsia="PMingLiU" w:hint="eastAsia"/>
+          <w:u w:val="single"/>
+          <w:lang w:eastAsia="zh-TW"/>
+        </w:rPr>
+        <w:lastRenderedPageBreak/>
+        <w:t>Repush and Build command</w:t>
+      </w:r>
+    </w:p>
+    <w:p>
+      <w:pPr>
+        <w:rPr>
+          <w:rFonts w:eastAsia="PMingLiU"/>
+          <w:highlight w:val="yellow"/>
+          <w:lang w:eastAsia="zh-TW"/>
+        </w:rPr>
+      </w:pPr>
+      <w:r>
+        <w:rPr>
+          <w:rFonts w:eastAsia="PMingLiU"/>
+          <w:highlight w:val="yellow"/>
+          <w:lang w:eastAsia="zh-TW"/>
+        </w:rPr>
+        <w:t>cd /d D:\Ring3</w:t>
+      </w:r>
+    </w:p>
+    <w:p>
+      <w:pPr>
+        <w:rPr>
+          <w:rFonts w:eastAsia="PMingLiU"/>
+          <w:highlight w:val="yellow"/>
+          <w:lang w:eastAsia="zh-TW"/>
+        </w:rPr>
+      </w:pPr>
+    </w:p>
+    <w:p>
+      <w:pPr>
+        <w:rPr>
+          <w:rFonts w:eastAsia="PMingLiU"/>
+          <w:highlight w:val="yellow"/>
+          <w:lang w:eastAsia="zh-TW"/>
+        </w:rPr>
+      </w:pPr>
+      <w:r>
+        <w:rPr>
+          <w:rFonts w:eastAsia="PMingLiU"/>
+          <w:highlight w:val="yellow"/>
+          <w:lang w:eastAsia="zh-TW"/>
+        </w:rPr>
+        <w:t>git status</w:t>
+      </w:r>
+    </w:p>
+    <w:p>
+      <w:pPr>
+        <w:rPr>
+          <w:rFonts w:eastAsia="PMingLiU"/>
+          <w:highlight w:val="yellow"/>
+          <w:lang w:eastAsia="zh-TW"/>
+        </w:rPr>
+      </w:pPr>
+      <w:r>
+        <w:rPr>
+          <w:rFonts w:eastAsia="PMingLiU"/>
+          <w:highlight w:val="yellow"/>
+          <w:lang w:eastAsia="zh-TW"/>
+        </w:rPr>
+        <w:t>git pull --rebase origin main</w:t>
+      </w:r>
+    </w:p>
+    <w:p>
+      <w:pPr>
+        <w:rPr>
+          <w:rFonts w:eastAsia="PMingLiU"/>
+          <w:highlight w:val="yellow"/>
+          <w:lang w:eastAsia="zh-TW"/>
+        </w:rPr>
+      </w:pPr>
+      <w:r>
+        <w:rPr>
+          <w:rFonts w:eastAsia="PMingLiU"/>
+          <w:highlight w:val="yellow"/>
+          <w:lang w:eastAsia="zh-TW"/>
+        </w:rPr>
+        <w:t xml:space="preserve">git </w:t>
+      </w:r>
+      <w:proofErr w:type="gramStart"/>
+      <w:r>
+        <w:rPr>
+          <w:rFonts w:eastAsia="PMingLiU"/>
+          <w:highlight w:val="yellow"/>
+          <w:lang w:eastAsia="zh-TW"/>
+        </w:rPr>
+        <w:t>add .</w:t>
+      </w:r>
+      <w:proofErr w:type="spellStart"/>
+      <w:r>
+        <w:rPr>
+          <w:rFonts w:eastAsia="PMingLiU"/>
+          <w:highlight w:val="yellow"/>
+          <w:lang w:eastAsia="zh-TW"/>
+        </w:rPr>
+        <w:t>gitignore</w:t>
+      </w:r>
+      <w:proofErr w:type="spellEnd"/>
+      <w:proofErr w:type="gramEnd"/>
+    </w:p>
+    <w:p>
+      <w:pPr>
+        <w:rPr>
+          <w:rFonts w:eastAsia="PMingLiU"/>
+          <w:highlight w:val="yellow"/>
+          <w:lang w:eastAsia="zh-TW"/>
+        </w:rPr>
+      </w:pPr>
+      <w:r>
+        <w:rPr>
+          <w:rFonts w:eastAsia="PMingLiU"/>
+          <w:highlight w:val="yellow"/>
+          <w:lang w:eastAsia="zh-TW"/>
+        </w:rPr>
+        <w:t xml:space="preserve">git commit -m "Update </w:t>
+      </w:r>
+      <w:proofErr w:type="spellStart"/>
+      <w:r>
+        <w:rPr>
+          <w:rFonts w:eastAsia="PMingLiU"/>
+          <w:highlight w:val="yellow"/>
+          <w:lang w:eastAsia="zh-TW"/>
+        </w:rPr>
+        <w:t>gitignore</w:t>
+      </w:r>
+      <w:proofErr w:type="spellEnd"/>
+      <w:r>
+        <w:rPr>
+          <w:rFonts w:eastAsia="PMingLiU"/>
+          <w:highlight w:val="yellow"/>
+          <w:lang w:eastAsia="zh-TW"/>
+        </w:rPr>
+        <w:t>"</w:t>
+      </w:r>
+    </w:p>
+    <w:p>
+      <w:pPr>
+        <w:rPr>
+          <w:rFonts w:eastAsia="PMingLiU"/>
+          <w:lang w:eastAsia="zh-TW"/>
+        </w:rPr>
+      </w:pPr>
+      <w:r>
+        <w:rPr>
+          <w:rFonts w:eastAsia="PMingLiU"/>
+          <w:highlight w:val="yellow"/>
+          <w:lang w:eastAsia="zh-TW"/>
+        </w:rPr>
+        <w:t>git push -u origin main</w:t>
+      </w:r>
+    </w:p>
+    <w:p>
+      <w:pPr>
+        <w:rPr>
+          <w:rFonts w:eastAsia="PMingLiU" w:hint="eastAsia"/>
+          <w:u w:val="single"/>
+          <w:lang w:eastAsia="zh-TW"/>
+        </w:rPr>
+      </w:pPr>
+    </w:p>
     <w:sectPr>
       <w:pgSz w:w="11906" w:h="16838"/>
       <w:pgMar w:top="1440" w:right="1440" w:bottom="1440" w:left="1440" w:header="708" w:footer="708" w:gutter="0"/>

</xml_diff>

<commit_message>
Update WhatsApp inbox and styles
</commit_message>
<xml_diff>
--- a/Git and production.docx
+++ b/Git and production.docx
@@ -37,30 +37,12 @@
     </w:p>
     <w:p>
       <w:r>
-        <w:t xml:space="preserve">git </w:t>
-      </w:r>
-      <w:proofErr w:type="gramStart"/>
-      <w:r>
-        <w:t>add .</w:t>
-      </w:r>
-      <w:proofErr w:type="spellStart"/>
-      <w:r>
-        <w:t>gitignore</w:t>
-      </w:r>
-      <w:proofErr w:type="spellEnd"/>
-      <w:proofErr w:type="gramEnd"/>
-    </w:p>
-    <w:p>
-      <w:r>
-        <w:t xml:space="preserve">git commit -m "Update </w:t>
-      </w:r>
-      <w:proofErr w:type="spellStart"/>
-      <w:r>
-        <w:t>gitignore</w:t>
-      </w:r>
-      <w:proofErr w:type="spellEnd"/>
-      <w:r>
-        <w:t>"</w:t>
+        <w:t>git add .gitignore</w:t>
+      </w:r>
+    </w:p>
+    <w:p>
+      <w:r>
+        <w:t>git commit -m "Update gitignore"</w:t>
       </w:r>
     </w:p>
     <w:p>
@@ -269,78 +251,40 @@
           <w:highlight w:val="yellow"/>
           <w:lang w:eastAsia="zh-TW"/>
         </w:rPr>
-        <w:t>curl -</w:t>
-      </w:r>
-      <w:proofErr w:type="spellStart"/>
-      <w:r>
-        <w:rPr>
-          <w:rFonts w:eastAsia="PMingLiU"/>
-          <w:highlight w:val="yellow"/>
-          <w:lang w:eastAsia="zh-TW"/>
-        </w:rPr>
-        <w:t>fsSL</w:t>
-      </w:r>
-      <w:proofErr w:type="spellEnd"/>
-      <w:r>
-        <w:rPr>
-          <w:rFonts w:eastAsia="PMingLiU"/>
-          <w:highlight w:val="yellow"/>
-          <w:lang w:eastAsia="zh-TW"/>
-        </w:rPr>
-        <w:t xml:space="preserve"> https://deb.nodesource.com/setup_20.x | bash -</w:t>
-      </w:r>
-    </w:p>
-    <w:p>
-      <w:pPr>
-        <w:rPr>
-          <w:rFonts w:eastAsia="PMingLiU"/>
-          <w:highlight w:val="yellow"/>
-          <w:lang w:eastAsia="zh-TW"/>
-        </w:rPr>
-      </w:pPr>
-      <w:r>
-        <w:rPr>
-          <w:rFonts w:eastAsia="PMingLiU"/>
-          <w:highlight w:val="yellow"/>
-          <w:lang w:eastAsia="zh-TW"/>
-        </w:rPr>
-        <w:t xml:space="preserve">apt install -y </w:t>
-      </w:r>
-      <w:proofErr w:type="spellStart"/>
-      <w:r>
-        <w:rPr>
-          <w:rFonts w:eastAsia="PMingLiU"/>
-          <w:highlight w:val="yellow"/>
-          <w:lang w:eastAsia="zh-TW"/>
-        </w:rPr>
-        <w:t>nodejs</w:t>
-      </w:r>
-      <w:proofErr w:type="spellEnd"/>
-    </w:p>
-    <w:p>
-      <w:pPr>
-        <w:rPr>
-          <w:rFonts w:eastAsia="PMingLiU"/>
-          <w:lang w:eastAsia="zh-TW"/>
-        </w:rPr>
-      </w:pPr>
-      <w:proofErr w:type="spellStart"/>
-      <w:r>
-        <w:rPr>
-          <w:rFonts w:eastAsia="PMingLiU"/>
-          <w:highlight w:val="yellow"/>
-          <w:lang w:eastAsia="zh-TW"/>
-        </w:rPr>
-        <w:t>npm</w:t>
-      </w:r>
-      <w:proofErr w:type="spellEnd"/>
-      <w:r>
-        <w:rPr>
-          <w:rFonts w:eastAsia="PMingLiU"/>
-          <w:highlight w:val="yellow"/>
-          <w:lang w:eastAsia="zh-TW"/>
-        </w:rPr>
-        <w:t xml:space="preserve"> install -g pm2</w:t>
+        <w:t>curl -fsSL https://deb.nodesource.com/setup_20.x | bash -</w:t>
+      </w:r>
+    </w:p>
+    <w:p>
+      <w:pPr>
+        <w:rPr>
+          <w:rFonts w:eastAsia="PMingLiU"/>
+          <w:highlight w:val="yellow"/>
+          <w:lang w:eastAsia="zh-TW"/>
+        </w:rPr>
+      </w:pPr>
+      <w:r>
+        <w:rPr>
+          <w:rFonts w:eastAsia="PMingLiU"/>
+          <w:highlight w:val="yellow"/>
+          <w:lang w:eastAsia="zh-TW"/>
+        </w:rPr>
+        <w:t>apt install -y nodejs</w:t>
+      </w:r>
+    </w:p>
+    <w:p>
+      <w:pPr>
+        <w:rPr>
+          <w:rFonts w:eastAsia="PMingLiU"/>
+          <w:lang w:eastAsia="zh-TW"/>
+        </w:rPr>
+      </w:pPr>
+      <w:r>
+        <w:rPr>
+          <w:rFonts w:eastAsia="PMingLiU"/>
+          <w:highlight w:val="yellow"/>
+          <w:lang w:eastAsia="zh-TW"/>
+        </w:rPr>
+        <w:t>npm install -g pm2</w:t>
       </w:r>
     </w:p>
     <w:p>
@@ -420,21 +364,12 @@
           <w:lang w:eastAsia="zh-TW"/>
         </w:rPr>
       </w:pPr>
-      <w:proofErr w:type="spellStart"/>
-      <w:r>
-        <w:rPr>
-          <w:rFonts w:eastAsia="PMingLiU"/>
-          <w:lang w:eastAsia="zh-TW"/>
-        </w:rPr>
-        <w:t>npm</w:t>
-      </w:r>
-      <w:proofErr w:type="spellEnd"/>
-      <w:r>
-        <w:rPr>
-          <w:rFonts w:eastAsia="PMingLiU"/>
-          <w:lang w:eastAsia="zh-TW"/>
-        </w:rPr>
-        <w:t xml:space="preserve"> ci</w:t>
+      <w:r>
+        <w:rPr>
+          <w:rFonts w:eastAsia="PMingLiU"/>
+          <w:lang w:eastAsia="zh-TW"/>
+        </w:rPr>
+        <w:t>npm ci</w:t>
       </w:r>
     </w:p>
     <w:p>
@@ -558,62 +493,24 @@
           <w:highlight w:val="yellow"/>
           <w:lang w:eastAsia="zh-TW"/>
         </w:rPr>
-        <w:t xml:space="preserve">git </w:t>
-      </w:r>
-      <w:proofErr w:type="gramStart"/>
-      <w:r>
-        <w:rPr>
-          <w:rFonts w:eastAsia="PMingLiU"/>
-          <w:highlight w:val="yellow"/>
-          <w:lang w:eastAsia="zh-TW"/>
-        </w:rPr>
-        <w:t>add .</w:t>
-      </w:r>
-      <w:proofErr w:type="spellStart"/>
-      <w:r>
-        <w:rPr>
-          <w:rFonts w:eastAsia="PMingLiU"/>
-          <w:highlight w:val="yellow"/>
-          <w:lang w:eastAsia="zh-TW"/>
-        </w:rPr>
-        <w:t>gitignore</w:t>
-      </w:r>
-      <w:proofErr w:type="spellEnd"/>
-      <w:proofErr w:type="gramEnd"/>
-    </w:p>
-    <w:p>
-      <w:pPr>
-        <w:rPr>
-          <w:rFonts w:eastAsia="PMingLiU"/>
-          <w:highlight w:val="yellow"/>
-          <w:lang w:eastAsia="zh-TW"/>
-        </w:rPr>
-      </w:pPr>
-      <w:r>
-        <w:rPr>
-          <w:rFonts w:eastAsia="PMingLiU"/>
-          <w:highlight w:val="yellow"/>
-          <w:lang w:eastAsia="zh-TW"/>
-        </w:rPr>
-        <w:t xml:space="preserve">git commit -m "Update </w:t>
-      </w:r>
-      <w:proofErr w:type="spellStart"/>
-      <w:r>
-        <w:rPr>
-          <w:rFonts w:eastAsia="PMingLiU"/>
-          <w:highlight w:val="yellow"/>
-          <w:lang w:eastAsia="zh-TW"/>
-        </w:rPr>
-        <w:t>gitignore</w:t>
-      </w:r>
-      <w:proofErr w:type="spellEnd"/>
-      <w:r>
-        <w:rPr>
-          <w:rFonts w:eastAsia="PMingLiU"/>
-          <w:highlight w:val="yellow"/>
-          <w:lang w:eastAsia="zh-TW"/>
-        </w:rPr>
-        <w:t>"</w:t>
+        <w:t>git add .gitignore</w:t>
+      </w:r>
+    </w:p>
+    <w:p>
+      <w:pPr>
+        <w:rPr>
+          <w:rFonts w:eastAsia="PMingLiU"/>
+          <w:highlight w:val="yellow"/>
+          <w:lang w:eastAsia="zh-TW"/>
+        </w:rPr>
+      </w:pPr>
+      <w:r>
+        <w:rPr>
+          <w:rFonts w:eastAsia="PMingLiU"/>
+          <w:highlight w:val="yellow"/>
+          <w:lang w:eastAsia="zh-TW"/>
+        </w:rPr>
+        <w:t>git commit -m "Update gitignore"</w:t>
       </w:r>
     </w:p>
     <w:p>
@@ -630,6 +527,135 @@
           <w:lang w:eastAsia="zh-TW"/>
         </w:rPr>
         <w:t>git push -u origin main</w:t>
+      </w:r>
+    </w:p>
+    <w:p>
+      <w:pPr>
+        <w:rPr>
+          <w:rFonts w:eastAsia="PMingLiU"/>
+          <w:lang w:eastAsia="zh-TW"/>
+        </w:rPr>
+      </w:pPr>
+    </w:p>
+    <w:p>
+      <w:pPr>
+        <w:rPr>
+          <w:rFonts w:eastAsia="PMingLiU" w:hint="eastAsia"/>
+          <w:lang w:eastAsia="zh-TW"/>
+        </w:rPr>
+      </w:pPr>
+      <w:r>
+        <w:rPr>
+          <w:rFonts w:eastAsia="PMingLiU" w:hint="eastAsia"/>
+          <w:lang w:eastAsia="zh-TW"/>
+        </w:rPr>
+        <w:t>VPS</w:t>
+      </w:r>
+    </w:p>
+    <w:p>
+      <w:pPr>
+        <w:rPr>
+          <w:rFonts w:eastAsia="PMingLiU"/>
+          <w:lang w:eastAsia="zh-TW"/>
+        </w:rPr>
+      </w:pPr>
+      <w:r>
+        <w:rPr>
+          <w:rFonts w:eastAsia="PMingLiU"/>
+          <w:lang w:eastAsia="zh-TW"/>
+        </w:rPr>
+        <w:t>cd /var/www</w:t>
+      </w:r>
+    </w:p>
+    <w:p>
+      <w:pPr>
+        <w:rPr>
+          <w:rFonts w:eastAsia="PMingLiU"/>
+          <w:lang w:eastAsia="zh-TW"/>
+        </w:rPr>
+      </w:pPr>
+      <w:r>
+        <w:rPr>
+          <w:rFonts w:eastAsia="PMingLiU"/>
+          <w:lang w:eastAsia="zh-TW"/>
+        </w:rPr>
+        <w:t>rm -rf FYP</w:t>
+      </w:r>
+    </w:p>
+    <w:p>
+      <w:pPr>
+        <w:rPr>
+          <w:rFonts w:eastAsia="PMingLiU"/>
+          <w:lang w:eastAsia="zh-TW"/>
+        </w:rPr>
+      </w:pPr>
+      <w:r>
+        <w:rPr>
+          <w:rFonts w:eastAsia="PMingLiU"/>
+          <w:lang w:eastAsia="zh-TW"/>
+        </w:rPr>
+        <w:t>git clone https://github.com/qqqqqxx123/FYP.git</w:t>
+      </w:r>
+    </w:p>
+    <w:p>
+      <w:pPr>
+        <w:rPr>
+          <w:rFonts w:eastAsia="PMingLiU"/>
+          <w:lang w:eastAsia="zh-TW"/>
+        </w:rPr>
+      </w:pPr>
+    </w:p>
+    <w:p>
+      <w:pPr>
+        <w:rPr>
+          <w:rFonts w:eastAsia="PMingLiU"/>
+          <w:lang w:eastAsia="zh-TW"/>
+        </w:rPr>
+      </w:pPr>
+      <w:r>
+        <w:rPr>
+          <w:rFonts w:eastAsia="PMingLiU"/>
+          <w:lang w:eastAsia="zh-TW"/>
+        </w:rPr>
+        <w:t>cd FYP</w:t>
+      </w:r>
+    </w:p>
+    <w:p>
+      <w:pPr>
+        <w:rPr>
+          <w:rFonts w:eastAsia="PMingLiU"/>
+          <w:lang w:eastAsia="zh-TW"/>
+        </w:rPr>
+      </w:pPr>
+      <w:r>
+        <w:rPr>
+          <w:rFonts w:eastAsia="PMingLiU" w:hint="eastAsia"/>
+          <w:lang w:eastAsia="zh-TW"/>
+        </w:rPr>
+        <w:t>nano .env</w:t>
+      </w:r>
+    </w:p>
+    <w:p>
+      <w:pPr>
+        <w:rPr>
+          <w:rFonts w:eastAsia="PMingLiU" w:hint="eastAsia"/>
+          <w:lang w:eastAsia="zh-TW"/>
+        </w:rPr>
+      </w:pPr>
+    </w:p>
+    <w:p>
+      <w:pPr>
+        <w:rPr>
+          <w:rFonts w:eastAsia="PMingLiU"/>
+          <w:lang w:eastAsia="zh-TW"/>
+        </w:rPr>
+      </w:pPr>
+      <w:r>
+        <w:rPr>
+          <w:rFonts w:eastAsia="PMingLiU"/>
+          <w:lang w:eastAsia="zh-TW"/>
+        </w:rPr>
+        <w:t>npm install</w:t>
       </w:r>
     </w:p>
     <w:p>
@@ -640,6 +666,13 @@
           <w:lang w:eastAsia="zh-TW"/>
         </w:rPr>
       </w:pPr>
+      <w:r>
+        <w:rPr>
+          <w:rFonts w:eastAsia="PMingLiU"/>
+          <w:lang w:eastAsia="zh-TW"/>
+        </w:rPr>
+        <w:t>npm run build</w:t>
+      </w:r>
     </w:p>
     <w:sectPr>
       <w:pgSz w:w="11906" w:h="16838"/>

</xml_diff>